<commit_message>
fix(suelos): el indice de tablas y fotografias de 64-11 mostraba 'Punto XXX' y 'Fotografia N. XXXXXXX' literales; ahora usa los mismos tags que los titulos del cuerpo
Se conserva copia previa en templates/reports/_backups_2026-09-23/. Pendiente: linea 'OT XXXX-A-XXXX-VXX' del encabezado (sin dato definido en el sistema).

Co-Authored-By: Claude Sonnet 5 <noreply@anthropic.com>
</commit_message>
<xml_diff>
--- a/server/templates/reports/FO-PO-PSM-64-11 FORMATO PARA LA ELABORACIÓN DE INFORME DE SUELOS-plantilla.docx
+++ b/server/templates/reports/FO-PO-PSM-64-11 FORMATO PARA LA ELABORACIÓN DE INFORME DE SUELOS-plantilla.docx
@@ -3414,7 +3414,7 @@
             <w:noProof/>
             <w:lang w:val="es-CO"/>
           </w:rPr>
-          <w:t xml:space="preserve"> Punto XXX - Ensayo 1</w:t>
+          <w:t xml:space="preserve"> Punto {punto_nombre_caption_tabla8} - Ensayo 1</w:t>
         </w:r>
         <w:r>
           <w:rPr>
@@ -3499,7 +3499,7 @@
             <w:noProof/>
             <w:lang w:val="es-CO"/>
           </w:rPr>
-          <w:t xml:space="preserve"> Punto XXX - Ensayo 2</w:t>
+          <w:t xml:space="preserve"> Punto {punto_nombre_caption_tabla9} - Ensayo 2</w:t>
         </w:r>
         <w:r>
           <w:rPr>
@@ -3958,7 +3958,7 @@
             <w:rFonts w:cs="Calibri"/>
             <w:noProof/>
           </w:rPr>
-          <w:t>Fotografía 1. XXXXXXX</w:t>
+          <w:t>Fotografía 1. {foto1_caption}</w:t>
         </w:r>
         <w:r>
           <w:rPr>
@@ -4033,7 +4033,7 @@
             <w:rFonts w:cs="Calibri"/>
             <w:noProof/>
           </w:rPr>
-          <w:t>Fotografía 2. XXXXXX</w:t>
+          <w:t>Fotografía 2. {foto2_caption}</w:t>
         </w:r>
         <w:r>
           <w:rPr>

</xml_diff>